<commit_message>
Ask students to open tool accounts before each session
Adds a ready-to-send pre-session message per session, a 'before next
session' section in each booklet, and updated homework slides, scripts and
lecturer checklists so class time goes to creating, not signing up.

Co-Authored-By: Claude Opus 5.5 <noreply@anthropic.com>
Claude-Session: https://claude.ai/code/session_01KYVx18xMYxByYxo559XEXy
</commit_message>
<xml_diff>
--- a/קורס בסיסי AI/שיעור 1/חוברת עזר למשתתפים שיעור 1.docx
+++ b/קורס בסיסי AI/שיעור 1/חוברת עזר למשתתפים שיעור 1.docx
@@ -423,6 +423,165 @@
         <w:t>☐ בחרו עסק, רעיון או מותג אישי. עליו נעבוד עד סוף הקורס.</w:t>
       </w:r>
     </w:p>
+    <w:p>
+      <w:pPr>
+        <w:pStyle w:val="Heading1"/>
+        <w:bidi/>
+        <w:jc w:val="right"/>
+      </w:pPr>
+      <w:r>
+        <w:rPr>
+          <w:rtl/>
+        </w:rPr>
+        <w:t>לפני מפגש 2: פותחים חשבונות</w:t>
+      </w:r>
+    </w:p>
+    <w:p>
+      <w:pPr>
+        <w:bidi/>
+        <w:jc w:val="right"/>
+      </w:pPr>
+      <w:r>
+        <w:rPr>
+          <w:i w:val="0"/>
+          <w:rtl/>
+        </w:rPr>
+        <w:t>כדי שבשיעור נספיק ליצור ולא להירשם. חינם, בלי כרטיס אשראי.</w:t>
+      </w:r>
+    </w:p>
+    <w:p>
+      <w:pPr>
+        <w:bidi/>
+        <w:jc w:val="right"/>
+      </w:pPr>
+      <w:r>
+        <w:rPr>
+          <w:b/>
+          <w:rtl/>
+        </w:rPr>
+        <w:t xml:space="preserve">ChatGPT: </w:t>
+      </w:r>
+      <w:r>
+        <w:rPr>
+          <w:i w:val="0"/>
+          <w:rtl/>
+        </w:rPr>
+        <w:t>chatgpt.com</w:t>
+      </w:r>
+    </w:p>
+    <w:p>
+      <w:pPr>
+        <w:bidi/>
+        <w:jc w:val="right"/>
+      </w:pPr>
+      <w:r>
+        <w:rPr>
+          <w:b/>
+          <w:rtl/>
+        </w:rPr>
+        <w:t xml:space="preserve">Claude: </w:t>
+      </w:r>
+      <w:r>
+        <w:rPr>
+          <w:i w:val="0"/>
+          <w:rtl/>
+        </w:rPr>
+        <w:t>claude.ai</w:t>
+      </w:r>
+    </w:p>
+    <w:p>
+      <w:pPr>
+        <w:bidi/>
+        <w:jc w:val="right"/>
+      </w:pPr>
+      <w:r>
+        <w:rPr>
+          <w:b/>
+          <w:rtl/>
+        </w:rPr>
+        <w:t xml:space="preserve">Gemini: </w:t>
+      </w:r>
+      <w:r>
+        <w:rPr>
+          <w:i w:val="0"/>
+          <w:rtl/>
+        </w:rPr>
+        <w:t>gemini.google.com</w:t>
+      </w:r>
+    </w:p>
+    <w:p>
+      <w:pPr>
+        <w:bidi/>
+        <w:jc w:val="right"/>
+      </w:pPr>
+      <w:r>
+        <w:rPr>
+          <w:b/>
+          <w:rtl/>
+        </w:rPr>
+        <w:t xml:space="preserve">Perplexity: </w:t>
+      </w:r>
+      <w:r>
+        <w:rPr>
+          <w:i w:val="0"/>
+          <w:rtl/>
+        </w:rPr>
+        <w:t>perplexity.ai</w:t>
+      </w:r>
+    </w:p>
+    <w:p>
+      <w:pPr>
+        <w:bidi/>
+        <w:jc w:val="right"/>
+      </w:pPr>
+      <w:r>
+        <w:rPr>
+          <w:b/>
+          <w:rtl/>
+        </w:rPr>
+        <w:t xml:space="preserve">NotebookLM: </w:t>
+      </w:r>
+      <w:r>
+        <w:rPr>
+          <w:i w:val="0"/>
+          <w:rtl/>
+        </w:rPr>
+        <w:t>notebooklm.google.com</w:t>
+      </w:r>
+    </w:p>
+    <w:p>
+      <w:pPr>
+        <w:bidi/>
+        <w:jc w:val="right"/>
+      </w:pPr>
+      <w:r>
+        <w:rPr>
+          <w:b/>
+          <w:rtl/>
+        </w:rPr>
+        <w:t xml:space="preserve">Wispr Flow: </w:t>
+      </w:r>
+      <w:r>
+        <w:rPr>
+          <w:i w:val="0"/>
+          <w:rtl/>
+        </w:rPr>
+        <w:t>wisprflow.ai</w:t>
+      </w:r>
+    </w:p>
+    <w:p>
+      <w:pPr>
+        <w:bidi/>
+        <w:jc w:val="right"/>
+      </w:pPr>
+      <w:r>
+        <w:rPr>
+          <w:i w:val="0"/>
+          <w:rtl/>
+        </w:rPr>
+        <w:t>ומתקינים את Wispr Flow במחשב.</w:t>
+      </w:r>
+    </w:p>
     <w:sectPr>
       <w:pgSz w:w="12240" w:h="15840"/>
       <w:pgMar w:top="1440" w:right="1200" w:bottom="1440" w:left="1200" w:header="720" w:footer="720" w:gutter="0"/>

</xml_diff>

<commit_message>
Add how-it-works, token-saving and productivity-tricks slides
Session 2: what happens when you press Enter, how to save tokens, 8 tricks;
session 3: how image models turn noise into a picture; session 4: the agent
loop. Copilot and DeepSeek added to toolboxes, booklets and prep messages.
Scripts written for Zoom.

Co-Authored-By: Claude Opus 5.5 <noreply@anthropic.com>
Claude-Session: https://claude.ai/code/session_01KYVx18xMYxByYxo559XEXy
</commit_message>
<xml_diff>
--- a/קורס בסיסי AI/שיעור 1/חוברת עזר למשתתפים שיעור 1.docx
+++ b/קורס בסיסי AI/שיעור 1/חוברת עזר למשתתפים שיעור 1.docx
@@ -277,6 +277,26 @@
           <w:rtl/>
         </w:rPr>
         <w:t>copilot.microsoft.com</w:t>
+      </w:r>
+    </w:p>
+    <w:p>
+      <w:pPr>
+        <w:bidi/>
+        <w:jc w:val="right"/>
+      </w:pPr>
+      <w:r>
+        <w:rPr>
+          <w:b/>
+          <w:rtl/>
+        </w:rPr>
+        <w:t xml:space="preserve">DeepSeek: </w:t>
+      </w:r>
+      <w:r>
+        <w:rPr>
+          <w:i w:val="0"/>
+          <w:rtl/>
+        </w:rPr>
+        <w:t>chat.deepseek.com</w:t>
       </w:r>
     </w:p>
     <w:p>

</xml_diff>